<commit_message>
fix: preserve Korean document phrase boundaries
</commit_message>
<xml_diff>
--- a/tests/formats/output/studio-live-service-rpg-economy/brief.docx
+++ b/tests/formats/output/studio-live-service-rpg-economy/brief.docx
@@ -66,7 +66,19 @@
           <w:color w:val="0F172A"/>
           <w:sz w:val="22"/>
         </w:rPr>
-        <w:t>일일 미션에서 소프트 재화를 공급하고 업그레이드에서 소비한다. 목표 보유량은 5,000이다.</w:t>
+        <w:t>일일 미션에서 소프트 재화를 공급하고 업그레이드에서 소비한다.</w:t>
+      </w:r>
+      <w:r>
+        <w:br/>
+      </w:r>
+      <w:r>
+        <w:rPr>
+          <w:rFonts w:ascii="D2Coding" w:hAnsi="D2Coding" w:eastAsia="D2Coding" w:hint="eastAsia"/>
+          <w:b w:val="0"/>
+          <w:color w:val="0F172A"/>
+          <w:sz w:val="22"/>
+        </w:rPr>
+        <w:t>목표 보유량은 5,000이다.</w:t>
       </w:r>
     </w:p>
     <w:p>

</xml_diff>